<commit_message>
feat/fix: strict RBAC enforcement, dynamic departments, and progressive discipline
- feat(rbac): lock Sidebar and SettingsPage scope per user role (hide Global/branches for managers)
- fix(ui): restore responsive Sidebar and Settings tabs rendering
- feat(hr): implement progressive discipline tiers (0-3) in alertTriggers backend
- fix(staff): make AddStaffForm department dropdown dynamically load from branch config
- fix(staff): force branch selection for admins in Global View when creating staff
</commit_message>
<xml_diff>
--- a/public/templates/Warning_Notice.docx
+++ b/public/templates/Warning_Notice.docx
@@ -28,6 +28,7 @@
         </w:rPr>
         <w:br/>
       </w:r>
+      <w:proofErr w:type="spellStart"/>
       <w:r>
         <w:rPr>
           <w:rFonts w:ascii="Browallia New" w:eastAsia="Aptos" w:hAnsi="Browallia New" w:cs="Browallia New" w:hint="cs"/>
@@ -37,6 +38,7 @@
         </w:rPr>
         <w:t>หนังสือเตือนความประพฤติและวินัย</w:t>
       </w:r>
+      <w:proofErr w:type="spellEnd"/>
     </w:p>
     <w:p>
       <w:pPr>
@@ -69,6 +71,7 @@
         </w:rPr>
         <w:t xml:space="preserve">Date of Issue / </w:t>
       </w:r>
+      <w:proofErr w:type="spellStart"/>
       <w:r>
         <w:rPr>
           <w:rFonts w:ascii="Browallia New" w:eastAsia="Aptos" w:hAnsi="Browallia New" w:cs="Browallia New"/>
@@ -79,6 +82,7 @@
         </w:rPr>
         <w:t>วันที่ออกหนังสือ</w:t>
       </w:r>
+      <w:proofErr w:type="spellEnd"/>
       <w:r>
         <w:rPr>
           <w:rFonts w:ascii="Aptos" w:eastAsia="Aptos" w:hAnsi="Aptos" w:cs="Aptos"/>
@@ -117,6 +121,7 @@
         </w:rPr>
         <w:t xml:space="preserve">Employee Name / </w:t>
       </w:r>
+      <w:proofErr w:type="spellStart"/>
       <w:r>
         <w:rPr>
           <w:rFonts w:ascii="Browallia New" w:eastAsia="Aptos" w:hAnsi="Browallia New" w:cs="Browallia New"/>
@@ -127,6 +132,7 @@
         </w:rPr>
         <w:t>ชื่อพนักงาน</w:t>
       </w:r>
+      <w:proofErr w:type="spellEnd"/>
       <w:r>
         <w:rPr>
           <w:rFonts w:ascii="Aptos" w:eastAsia="Aptos" w:hAnsi="Aptos" w:cs="Aptos"/>
@@ -165,6 +171,7 @@
         </w:rPr>
         <w:t xml:space="preserve">Job Title / </w:t>
       </w:r>
+      <w:proofErr w:type="spellStart"/>
       <w:r>
         <w:rPr>
           <w:rFonts w:ascii="Browallia New" w:eastAsia="Aptos" w:hAnsi="Browallia New" w:cs="Browallia New"/>
@@ -175,6 +182,7 @@
         </w:rPr>
         <w:t>ตำแหน่งงาน</w:t>
       </w:r>
+      <w:proofErr w:type="spellEnd"/>
       <w:r>
         <w:rPr>
           <w:rFonts w:ascii="Aptos" w:eastAsia="Aptos" w:hAnsi="Aptos" w:cs="Aptos"/>
@@ -223,6 +231,7 @@
         </w:rPr>
         <w:t xml:space="preserve">Warning Level / </w:t>
       </w:r>
+      <w:proofErr w:type="spellStart"/>
       <w:r>
         <w:rPr>
           <w:rFonts w:ascii="Browallia New" w:eastAsia="Aptos" w:hAnsi="Browallia New" w:cs="Browallia New"/>
@@ -233,6 +242,7 @@
         </w:rPr>
         <w:t>ระดับการเตือน</w:t>
       </w:r>
+      <w:proofErr w:type="spellEnd"/>
       <w:r>
         <w:rPr>
           <w:rFonts w:ascii="Aptos" w:eastAsia="Aptos" w:hAnsi="Aptos" w:cs="Aptos"/>
@@ -271,6 +281,7 @@
         </w:rPr>
         <w:t xml:space="preserve">Date of Incident / </w:t>
       </w:r>
+      <w:proofErr w:type="spellStart"/>
       <w:r>
         <w:rPr>
           <w:rFonts w:ascii="Browallia New" w:eastAsia="Aptos" w:hAnsi="Browallia New" w:cs="Browallia New"/>
@@ -281,6 +292,7 @@
         </w:rPr>
         <w:t>วันที่เกิดเหตุ</w:t>
       </w:r>
+      <w:proofErr w:type="spellEnd"/>
       <w:r>
         <w:rPr>
           <w:rFonts w:ascii="Aptos" w:eastAsia="Aptos" w:hAnsi="Aptos" w:cs="Aptos"/>
@@ -331,6 +343,7 @@
         </w:rPr>
         <w:t xml:space="preserve">Reason for Warning / </w:t>
       </w:r>
+      <w:proofErr w:type="spellStart"/>
       <w:r>
         <w:rPr>
           <w:rFonts w:ascii="Browallia New" w:eastAsia="Aptos" w:hAnsi="Browallia New" w:cs="Browallia New"/>
@@ -341,6 +354,7 @@
         </w:rPr>
         <w:t>สาเหตุของการตักเตือน</w:t>
       </w:r>
+      <w:proofErr w:type="spellEnd"/>
       <w:r>
         <w:rPr>
           <w:rFonts w:ascii="Aptos" w:eastAsia="Aptos" w:hAnsi="Aptos" w:cs="Aptos"/>
@@ -395,7 +409,23 @@
           <w:sz w:val="24"/>
           <w:szCs w:val="24"/>
         </w:rPr>
-        <w:t xml:space="preserve">This notice serves as a formal record that your conduct/performance has not met the standards required by {{TRADING_NAME}}. </w:t>
+        <w:t xml:space="preserve">This notice serves as a formal record that your conduct/performance has not met the standards required by </w:t>
+      </w:r>
+      <w:r>
+        <w:rPr>
+          <w:rFonts w:ascii="Aptos" w:eastAsia="Aptos" w:hAnsi="Aptos" w:cs="Aptos"/>
+          <w:sz w:val="24"/>
+          <w:szCs w:val="24"/>
+        </w:rPr>
+        <w:t>{{COMPANY_LEGAL_NAME}}</w:t>
+      </w:r>
+      <w:r>
+        <w:rPr>
+          <w:rFonts w:ascii="Aptos" w:eastAsia="Aptos" w:hAnsi="Aptos" w:cs="Aptos"/>
+          <w:sz w:val="24"/>
+          <w:szCs w:val="24"/>
+        </w:rPr>
+        <w:t xml:space="preserve">. </w:t>
       </w:r>
     </w:p>
     <w:p>
@@ -407,6 +437,7 @@
           <w:szCs w:val="24"/>
         </w:rPr>
       </w:pPr>
+      <w:proofErr w:type="spellStart"/>
       <w:r>
         <w:rPr>
           <w:rFonts w:ascii="Browallia New" w:eastAsia="Aptos" w:hAnsi="Browallia New" w:cs="Browallia New"/>
@@ -415,6 +446,7 @@
         </w:rPr>
         <w:t>หนังสือฉบับนี้จัดทำขึ้นเพื่อเป็นบันทึกอย่างเป็นทางการว่า</w:t>
       </w:r>
+      <w:proofErr w:type="spellEnd"/>
       <w:r>
         <w:rPr>
           <w:rFonts w:ascii="Aptos" w:eastAsia="Aptos" w:hAnsi="Aptos" w:cs="Aptos"/>
@@ -423,6 +455,7 @@
         </w:rPr>
         <w:t xml:space="preserve"> </w:t>
       </w:r>
+      <w:proofErr w:type="spellStart"/>
       <w:r>
         <w:rPr>
           <w:rFonts w:ascii="Browallia New" w:eastAsia="Aptos" w:hAnsi="Browallia New" w:cs="Browallia New"/>
@@ -431,6 +464,7 @@
         </w:rPr>
         <w:t>ความประพฤติ</w:t>
       </w:r>
+      <w:proofErr w:type="spellEnd"/>
       <w:r>
         <w:rPr>
           <w:rFonts w:ascii="Aptos" w:eastAsia="Aptos" w:hAnsi="Aptos" w:cs="Aptos"/>
@@ -439,6 +473,7 @@
         </w:rPr>
         <w:t>/</w:t>
       </w:r>
+      <w:proofErr w:type="spellStart"/>
       <w:r>
         <w:rPr>
           <w:rFonts w:ascii="Browallia New" w:eastAsia="Aptos" w:hAnsi="Browallia New" w:cs="Browallia New"/>
@@ -447,14 +482,32 @@
         </w:rPr>
         <w:t>ผลการปฏิบัติงานของคุณไม่เป็นไปตามมาตรฐานที่</w:t>
       </w:r>
-      <w:r>
-        <w:rPr>
-          <w:rFonts w:ascii="Aptos" w:eastAsia="Aptos" w:hAnsi="Aptos" w:cs="Aptos"/>
-          <w:sz w:val="24"/>
-          <w:szCs w:val="24"/>
-        </w:rPr>
-        <w:t xml:space="preserve"> {{TRADING_NAME}} </w:t>
-      </w:r>
+      <w:proofErr w:type="spellEnd"/>
+      <w:r>
+        <w:rPr>
+          <w:rFonts w:ascii="Aptos" w:eastAsia="Aptos" w:hAnsi="Aptos" w:cs="Aptos"/>
+          <w:sz w:val="24"/>
+          <w:szCs w:val="24"/>
+        </w:rPr>
+        <w:t xml:space="preserve"> </w:t>
+      </w:r>
+      <w:r>
+        <w:rPr>
+          <w:rFonts w:ascii="Aptos" w:eastAsia="Aptos" w:hAnsi="Aptos" w:cs="Aptos"/>
+          <w:sz w:val="24"/>
+          <w:szCs w:val="24"/>
+        </w:rPr>
+        <w:t>{{COMPANY_LEGAL_NAME}}</w:t>
+      </w:r>
+      <w:r>
+        <w:rPr>
+          <w:rFonts w:ascii="Aptos" w:eastAsia="Aptos" w:hAnsi="Aptos" w:cs="Aptos"/>
+          <w:sz w:val="24"/>
+          <w:szCs w:val="24"/>
+        </w:rPr>
+        <w:t xml:space="preserve"> </w:t>
+      </w:r>
+      <w:proofErr w:type="spellStart"/>
       <w:r>
         <w:rPr>
           <w:rFonts w:ascii="Browallia New" w:eastAsia="Aptos" w:hAnsi="Browallia New" w:cs="Browallia New"/>
@@ -463,6 +516,7 @@
         </w:rPr>
         <w:t>กำหนด</w:t>
       </w:r>
+      <w:proofErr w:type="spellEnd"/>
     </w:p>
     <w:p>
       <w:pPr>
@@ -495,6 +549,7 @@
         </w:rPr>
         <w:t xml:space="preserve">Disciplinary Consequence / </w:t>
       </w:r>
+      <w:proofErr w:type="spellStart"/>
       <w:r>
         <w:rPr>
           <w:rFonts w:ascii="Browallia New" w:eastAsia="Aptos" w:hAnsi="Browallia New" w:cs="Browallia New"/>
@@ -505,6 +560,7 @@
         </w:rPr>
         <w:t>ผลทางวินัย</w:t>
       </w:r>
+      <w:proofErr w:type="spellEnd"/>
       <w:r>
         <w:rPr>
           <w:rFonts w:ascii="Aptos" w:eastAsia="Aptos" w:hAnsi="Aptos" w:cs="Aptos"/>
@@ -571,6 +627,7 @@
           <w:szCs w:val="24"/>
         </w:rPr>
       </w:pPr>
+      <w:proofErr w:type="spellStart"/>
       <w:r>
         <w:rPr>
           <w:rFonts w:ascii="Browallia New" w:eastAsia="Aptos" w:hAnsi="Browallia New" w:cs="Browallia New"/>
@@ -579,6 +636,7 @@
         </w:rPr>
         <w:t>การละเมิดกฎของบริษัทเพิ่มเติมหรือการไม่ปรับปรุงผลการปฏิบัติงาน</w:t>
       </w:r>
+      <w:proofErr w:type="spellEnd"/>
       <w:r>
         <w:rPr>
           <w:rFonts w:ascii="Aptos" w:eastAsia="Aptos" w:hAnsi="Aptos" w:cs="Aptos"/>
@@ -587,6 +645,7 @@
         </w:rPr>
         <w:t xml:space="preserve"> </w:t>
       </w:r>
+      <w:proofErr w:type="spellStart"/>
       <w:r>
         <w:rPr>
           <w:rFonts w:ascii="Browallia New" w:eastAsia="Aptos" w:hAnsi="Browallia New" w:cs="Browallia New"/>
@@ -595,6 +654,7 @@
         </w:rPr>
         <w:t>อาจส่งผลให้เกิดการดำเนินการทางวินัยในขั้นต่อไป</w:t>
       </w:r>
+      <w:proofErr w:type="spellEnd"/>
       <w:r>
         <w:rPr>
           <w:rFonts w:ascii="Aptos" w:eastAsia="Aptos" w:hAnsi="Aptos" w:cs="Aptos"/>
@@ -603,6 +663,7 @@
         </w:rPr>
         <w:t xml:space="preserve"> </w:t>
       </w:r>
+      <w:proofErr w:type="spellStart"/>
       <w:r>
         <w:rPr>
           <w:rFonts w:ascii="Browallia New" w:eastAsia="Aptos" w:hAnsi="Browallia New" w:cs="Browallia New"/>
@@ -611,6 +672,7 @@
         </w:rPr>
         <w:t>จนถึงขั้นเลิกจ้าง</w:t>
       </w:r>
+      <w:proofErr w:type="spellEnd"/>
     </w:p>
     <w:p>
       <w:pPr>
@@ -640,15 +702,6 @@
           <w:color w:val="1B1C1D"/>
         </w:rPr>
         <w:t xml:space="preserve">Employer </w:t>
-      </w:r>
-      <w:r>
-        <w:rPr>
-          <w:rFonts w:ascii="Aptos" w:eastAsia="Aptos" w:hAnsi="Aptos" w:cs="Aptos"/>
-          <w:b/>
-          <w:bCs/>
-          <w:color w:val="1B1C1D"/>
-        </w:rPr>
-        <w:t>(</w:t>
       </w:r>
       <w:r>
         <w:rPr>

</xml_diff>